<commit_message>
Ajouter autre cour java et cour compresser adresse ipv6 et convert binaire to decimale
</commit_message>
<xml_diff>
--- a/Adresse IPv4 et IPv6/IP Ancien .docx
+++ b/Adresse IPv4 et IPv6/IP Ancien .docx
@@ -198,6 +198,7 @@
       <w:pPr>
         <w:bidi/>
       </w:pPr>
+      <w:proofErr w:type="gramStart"/>
       <w:r>
         <w:rPr>
           <w:b/>
@@ -213,6 +214,7 @@
         </w:rPr>
         <w:t xml:space="preserve"> :</w:t>
       </w:r>
+      <w:proofErr w:type="gramEnd"/>
     </w:p>
     <w:p>
       <w:pPr>
@@ -227,10 +229,22 @@
           <w:b/>
           <w:bCs/>
         </w:rPr>
-        <w:t>IPv4</w:t>
-      </w:r>
-      <w:r>
-        <w:t xml:space="preserve">: </w:t>
+        <w:t>IPv</w:t>
+      </w:r>
+      <w:proofErr w:type="gramStart"/>
+      <w:r>
+        <w:rPr>
+          <w:b/>
+          <w:bCs/>
+        </w:rPr>
+        <w:t>4</w:t>
+      </w:r>
+      <w:r>
+        <w:t>:</w:t>
+      </w:r>
+      <w:proofErr w:type="gramEnd"/>
+      <w:r>
+        <w:t xml:space="preserve"> </w:t>
       </w:r>
       <w:r>
         <w:rPr>
@@ -255,10 +269,22 @@
           <w:b/>
           <w:bCs/>
         </w:rPr>
-        <w:t>IPv6</w:t>
-      </w:r>
-      <w:r>
-        <w:t xml:space="preserve">: </w:t>
+        <w:t>IPv</w:t>
+      </w:r>
+      <w:proofErr w:type="gramStart"/>
+      <w:r>
+        <w:rPr>
+          <w:b/>
+          <w:bCs/>
+        </w:rPr>
+        <w:t>6</w:t>
+      </w:r>
+      <w:r>
+        <w:t>:</w:t>
+      </w:r>
+      <w:proofErr w:type="gramEnd"/>
+      <w:r>
+        <w:t xml:space="preserve"> </w:t>
       </w:r>
       <w:r>
         <w:rPr>
@@ -346,6 +372,7 @@
       <w:pPr>
         <w:bidi/>
       </w:pPr>
+      <w:proofErr w:type="gramStart"/>
       <w:r>
         <w:rPr>
           <w:b/>
@@ -361,6 +388,7 @@
         </w:rPr>
         <w:t xml:space="preserve"> :</w:t>
       </w:r>
+      <w:proofErr w:type="gramEnd"/>
     </w:p>
     <w:p>
       <w:pPr>
@@ -425,8 +453,16 @@
         <w:rPr>
           <w:rtl/>
         </w:rPr>
-        <w:t>يتراوح بين 0 و 255</w:t>
-      </w:r>
+        <w:t xml:space="preserve">يتراوح بين 0 </w:t>
+      </w:r>
+      <w:proofErr w:type="gramStart"/>
+      <w:r>
+        <w:rPr>
+          <w:rtl/>
+        </w:rPr>
+        <w:t>و 255</w:t>
+      </w:r>
+      <w:proofErr w:type="gramEnd"/>
     </w:p>
     <w:p>
       <w:r>
@@ -819,6 +855,7 @@
       <w:pPr>
         <w:bidi/>
       </w:pPr>
+      <w:proofErr w:type="gramStart"/>
       <w:r>
         <w:rPr>
           <w:b/>
@@ -834,6 +871,7 @@
         </w:rPr>
         <w:t xml:space="preserve"> :</w:t>
       </w:r>
+      <w:proofErr w:type="gramEnd"/>
     </w:p>
     <w:p>
       <w:pPr>
@@ -1325,66 +1363,24 @@
     <w:p>
       <w:pPr>
         <w:spacing w:line="240" w:lineRule="auto"/>
-        <w:rPr>
-          <w:lang w:val="en-US"/>
-        </w:rPr>
-      </w:pPr>
-      <w:r>
-        <w:rPr>
-          <w:lang w:val="en-US"/>
-        </w:rPr>
-        <w:t xml:space="preserve"> </w:t>
-      </w:r>
-      <w:r>
-        <w:rPr>
-          <w:lang w:val="en-US"/>
-        </w:rPr>
-        <w:t>11000000</w:t>
-      </w:r>
-      <w:r>
-        <w:rPr>
-          <w:lang w:val="en-US"/>
-        </w:rPr>
-        <w:t xml:space="preserve"> = 8bits</w:t>
+      </w:pPr>
+      <w:r>
+        <w:t xml:space="preserve"> 11000000 = 8bits</w:t>
       </w:r>
     </w:p>
     <w:p>
       <w:pPr>
         <w:spacing w:line="240" w:lineRule="auto"/>
-        <w:rPr>
-          <w:lang w:val="en-US"/>
-        </w:rPr>
-      </w:pPr>
-      <w:r>
-        <w:rPr>
-          <w:lang w:val="en-US"/>
-        </w:rPr>
-        <w:t>10101000</w:t>
-      </w:r>
-      <w:r>
-        <w:rPr>
-          <w:lang w:val="en-US"/>
-        </w:rPr>
-        <w:t xml:space="preserve"> </w:t>
-      </w:r>
-      <w:r>
-        <w:rPr>
-          <w:lang w:val="en-US"/>
-        </w:rPr>
-        <w:t>= 8bits</w:t>
+      </w:pPr>
+      <w:r>
+        <w:t>10101000 = 8bits</w:t>
       </w:r>
     </w:p>
     <w:p>
       <w:pPr>
         <w:spacing w:line="240" w:lineRule="auto"/>
-        <w:rPr>
-          <w:lang w:val="en-US"/>
-        </w:rPr>
-      </w:pPr>
-      <w:r>
-        <w:rPr>
-          <w:lang w:val="en-US"/>
-        </w:rPr>
+      </w:pPr>
+      <w:r>
         <w:t>00000001= 8bits</w:t>
       </w:r>
     </w:p>
@@ -1393,20 +1389,16 @@
         <w:spacing w:line="240" w:lineRule="auto"/>
       </w:pPr>
       <w:r>
-        <w:t>00000001</w:t>
-      </w:r>
-      <w:r>
-        <w:t xml:space="preserve"> =</w:t>
-      </w:r>
-      <w:r>
-        <w:t>= 8bits</w:t>
-      </w:r>
-      <w:r>
-        <w:t xml:space="preserve">  </w:t>
-      </w:r>
-      <w:r>
-        <w:t xml:space="preserve">       (</w:t>
-      </w:r>
+        <w:t xml:space="preserve">00000001 == 8bits  </w:t>
+      </w:r>
+      <w:r>
+        <w:t xml:space="preserve">    </w:t>
+      </w:r>
+      <w:proofErr w:type="gramStart"/>
+      <w:r>
+        <w:t xml:space="preserve">   (</w:t>
+      </w:r>
+      <w:proofErr w:type="gramEnd"/>
       <w:r>
         <w:t>DONC TOTAL DE A</w:t>
       </w:r>
@@ -1477,7 +1469,15 @@
         </w:numPr>
       </w:pPr>
       <w:r>
-        <w:t>Format : 8 groupes hexadécimaux séparés par ":"</w:t>
+        <w:t xml:space="preserve">Format : 8 groupes hexadécimaux séparés par </w:t>
+      </w:r>
+      <w:proofErr w:type="gramStart"/>
+      <w:r>
+        <w:t>":</w:t>
+      </w:r>
+      <w:proofErr w:type="gramEnd"/>
+      <w:r>
+        <w:t>"</w:t>
       </w:r>
     </w:p>
     <w:p>
@@ -1488,13 +1488,38 @@
         </w:numPr>
       </w:pPr>
       <w:r>
-        <w:t>Exemple : 2001:db8:85a3::8a2e:370:7334</w:t>
+        <w:t xml:space="preserve">Exemple : </w:t>
+      </w:r>
+      <w:proofErr w:type="gramStart"/>
+      <w:r>
+        <w:t>2001:</w:t>
+      </w:r>
+      <w:proofErr w:type="gramEnd"/>
+      <w:r>
+        <w:t>db</w:t>
+      </w:r>
+      <w:proofErr w:type="gramStart"/>
+      <w:r>
+        <w:t>8:</w:t>
+      </w:r>
+      <w:proofErr w:type="gramEnd"/>
+      <w:r>
+        <w:t>85a3::8a2</w:t>
+      </w:r>
+      <w:proofErr w:type="gramStart"/>
+      <w:r>
+        <w:t>e:370:</w:t>
+      </w:r>
+      <w:proofErr w:type="gramEnd"/>
+      <w:r>
+        <w:t>7334</w:t>
       </w:r>
     </w:p>
     <w:p>
       <w:pPr>
         <w:bidi/>
       </w:pPr>
+      <w:proofErr w:type="gramStart"/>
       <w:r>
         <w:rPr>
           <w:b/>
@@ -1510,6 +1535,7 @@
         </w:rPr>
         <w:t xml:space="preserve"> :</w:t>
       </w:r>
+      <w:proofErr w:type="gramEnd"/>
     </w:p>
     <w:p>
       <w:pPr>
@@ -1547,11 +1573,19 @@
         <w:rPr>
           <w:rtl/>
         </w:rPr>
-        <w:t xml:space="preserve">يُكتب بـ 8 مجموعات ست عشرية مفصولة بـ </w:t>
+        <w:t xml:space="preserve">يُكتب بـ 8 مجموعات ست عشرية مفصولة </w:t>
+      </w:r>
+      <w:proofErr w:type="gramStart"/>
+      <w:r>
+        <w:rPr>
+          <w:rtl/>
+        </w:rPr>
+        <w:t xml:space="preserve">بـ </w:t>
       </w:r>
       <w:r>
         <w:t>:</w:t>
       </w:r>
+      <w:proofErr w:type="gramEnd"/>
     </w:p>
     <w:p>
       <w:pPr>
@@ -1578,16 +1612,71 @@
     <w:p>
       <w:pPr>
         <w:rPr>
-          <w:b/>
-          <w:bCs/>
-        </w:rPr>
-      </w:pPr>
-      <w:r>
-        <w:rPr>
           <w:rFonts w:ascii="Segoe UI Emoji" w:hAnsi="Segoe UI Emoji" w:cs="Segoe UI Emoji"/>
           <w:b/>
           <w:bCs/>
         </w:rPr>
+      </w:pPr>
+    </w:p>
+    <w:p>
+      <w:pPr>
+        <w:rPr>
+          <w:rFonts w:ascii="Segoe UI Emoji" w:hAnsi="Segoe UI Emoji" w:cs="Segoe UI Emoji"/>
+          <w:b/>
+          <w:bCs/>
+        </w:rPr>
+      </w:pPr>
+    </w:p>
+    <w:p>
+      <w:pPr>
+        <w:rPr>
+          <w:rFonts w:ascii="Segoe UI Emoji" w:hAnsi="Segoe UI Emoji" w:cs="Segoe UI Emoji"/>
+          <w:b/>
+          <w:bCs/>
+        </w:rPr>
+      </w:pPr>
+    </w:p>
+    <w:p>
+      <w:pPr>
+        <w:rPr>
+          <w:rFonts w:ascii="Segoe UI Emoji" w:hAnsi="Segoe UI Emoji" w:cs="Segoe UI Emoji"/>
+          <w:b/>
+          <w:bCs/>
+        </w:rPr>
+      </w:pPr>
+    </w:p>
+    <w:p>
+      <w:pPr>
+        <w:rPr>
+          <w:rFonts w:ascii="Segoe UI Emoji" w:hAnsi="Segoe UI Emoji" w:cs="Segoe UI Emoji"/>
+          <w:b/>
+          <w:bCs/>
+        </w:rPr>
+      </w:pPr>
+    </w:p>
+    <w:p>
+      <w:pPr>
+        <w:rPr>
+          <w:rFonts w:ascii="Segoe UI Emoji" w:hAnsi="Segoe UI Emoji" w:cs="Segoe UI Emoji"/>
+          <w:b/>
+          <w:bCs/>
+        </w:rPr>
+      </w:pPr>
+    </w:p>
+    <w:p>
+      <w:pPr>
+        <w:rPr>
+          <w:b/>
+          <w:bCs/>
+        </w:rPr>
+      </w:pPr>
+      <w:r>
+        <w:rPr>
+          <w:rFonts w:ascii="Segoe UI Emoji" w:hAnsi="Segoe UI Emoji" w:cs="Segoe UI Emoji"/>
+          <w:b/>
+          <w:bCs/>
+        </w:rPr>
+        <w:lastRenderedPageBreak/>
         <w:t>✅</w:t>
       </w:r>
       <w:r>
@@ -1812,8 +1901,13 @@
             <w:hideMark/>
           </w:tcPr>
           <w:p>
+            <w:proofErr w:type="gramStart"/>
             <w:r>
-              <w:t>2001:db8::1</w:t>
+              <w:t>2001:</w:t>
+            </w:r>
+            <w:proofErr w:type="gramEnd"/>
+            <w:r>
+              <w:t>db8::1</w:t>
             </w:r>
           </w:p>
         </w:tc>
@@ -1830,7 +1924,6 @@
           </w:tcPr>
           <w:p>
             <w:r>
-              <w:lastRenderedPageBreak/>
               <w:t>Nombre d’adresses</w:t>
             </w:r>
           </w:p>
@@ -4207,6 +4300,7 @@
   <w:style w:type="character" w:default="1" w:styleId="Policepardfaut">
     <w:name w:val="Default Paragraph Font"/>
     <w:uiPriority w:val="1"/>
+    <w:semiHidden/>
     <w:unhideWhenUsed/>
   </w:style>
   <w:style w:type="table" w:default="1" w:styleId="TableauNormal">

</xml_diff>